<commit_message>
Fix stale entries in the Word report generator and regenerate
reports/generate_report.py builds its own Word document independently of
PROJECT_REPORT.md (different structure, different audience) and turned out
to already be current and accurate across most chapters. Only Chapter 8
(Future Improvements) listed items that were already shipped: auto IP
blocking with a rollback timer and client-side JA3 TLS fingerprinting.
Reworded those entries to describe what actually remains (scheduled/
drift-triggered retraining, server-side JA3S/cert-issuer correlation, a
native push-notification mobile app vs. the existing web companion), added
the three detector modules missing from the Chapter 3 file tree (ip_blocker,
tls_inspector, ueba), and documented the BENIGN_PROFILE false-positive fix
and the sklearn feature-name warning fix in Chapter 7. Regenerated the docx.

Co-Authored-By: Claude Sonnet 5 <noreply@anthropic.com>
</commit_message>
<xml_diff>
--- a/reports/Security_Monitor_Project_Report.docx
+++ b/reports/Security_Monitor_Project_Report.docx
@@ -146,7 +146,7 @@
           <w:color w:val="5D6D7E"/>
           <w:sz w:val="22"/>
         </w:rPr>
-        <w:t>Date:        June 2026</w:t>
+        <w:t>Date:        September 2026</w:t>
       </w:r>
     </w:p>
     <w:p>
@@ -2256,6 +2256,12 @@
         <w:br/>
         <w:t xml:space="preserve">    ip_tracker.py         Per-IP heuristic scoring</w:t>
         <w:br/>
+        <w:t xml:space="preserve">    ip_blocker.py         Windows Firewall auto-block with rollback timer</w:t>
+        <w:br/>
+        <w:t xml:space="preserve">    tls_inspector.py      TLS Client Hello / JA3 fingerprint inspection</w:t>
+        <w:br/>
+        <w:t xml:space="preserve">    ueba.py               User behaviour analytics (off-hours/new-host)</w:t>
+        <w:br/>
         <w:t xml:space="preserve">  ddos_detector_model.joblib   Trained DDoS RF model (~15 MB)</w:t>
         <w:br/>
         <w:t xml:space="preserve">  anomaly_model.joblib         Isolation Forest model (~1.6 MB)</w:t>
@@ -6632,6 +6638,16 @@
     </w:p>
     <w:p>
       <w:pPr>
+        <w:pStyle w:val="ListBullet"/>
+        <w:spacing w:after="60"/>
+        <w:ind w:left="283"/>
+      </w:pPr>
+      <w:r>
+        <w:t>Adversarial Test Fixture: The BENIGN_PROFILE used by both the automated pytest suite and the Adversarial Lab's evasion baseline was a hand-picked feature vector that scored 98.7% attack probability under the trained classifier — a false positive in the fixture, not the model (which independently tests at 99.92% accuracy on real held-out data). Replaced with the median feature values of ~63,000 real BENIGN rows sampled from the training dataset; it now scores 0.36%. This reinforced the project's broader lesson: every "should not alert" fixture needs to be checked against real data, not just plausible-sounding numbers.</w:t>
+      </w:r>
+    </w:p>
+    <w:p>
+      <w:pPr>
         <w:pStyle w:val="Heading2"/>
         <w:jc w:val="left"/>
       </w:pPr>
@@ -6711,7 +6727,7 @@
         <w:jc w:val="both"/>
       </w:pPr>
       <w:r>
-        <w:t>When the DDoS classifier's predict() function received features as a plain dict rather than a DataFrame, the scikit-learn StandardScaler (fitted on a DataFrame with named columns) issued warnings and occasionally produced misaligned inputs. This was resolved by always constructing the feature vector by iterating over the model's stored feature_names list — ensuring consistent column order regardless of dictionary insertion order.</w:t>
+        <w:t>When the DDoS classifier's predict() function received features as a plain dict rather than a DataFrame, the scikit-learn StandardScaler (fitted on a DataFrame with named columns) issued warnings and occasionally produced misaligned inputs. The first fix was to always construct the feature vector by iterating over the model's stored feature_names list, ensuring consistent column order regardless of dictionary insertion order — but this still passed a bare NumPy array into scaler.transform(), so scikit-learn's "X does not have valid feature names" warning kept firing on every single prediction. The complete fix was to wrap the ordered values in a one-row pandas DataFrame using the same feature_names as columns before calling transform() — applied consistently across the DDoS detector, the anomaly detector, the adversarial engine, and the adaptive trainer's evaluation path, eliminating the warning entirely.</w:t>
       </w:r>
     </w:p>
     <w:p>
@@ -6822,10 +6838,10 @@
           <w:b/>
           <w:color w:val="1A4A8A"/>
         </w:rPr>
-        <w:t xml:space="preserve">Automated IP Blocking with Rollback Timer: </w:t>
+        <w:t xml:space="preserve">Scheduled / Drift-Triggered Retraining: </w:t>
       </w:r>
       <w:r>
-        <w:t>Extend the current manual IP blocking to support automatic blocking of confirmed ATTACK sources with a configurable TTL (e.g., 60 minutes), automatically releasing the block if no further malicious activity is detected.</w:t>
+        <w:t>Auto IP blocking with a rollback timer and JA3 client-side TLS fingerprinting already ship (ip_blocker.py, tls_inspector.py). What remains on that front is automating the ML side: retraining on a schedule or on detected concept drift, rather than only when an analyst manually triggers it from the Adaptive Training tab.</w:t>
       </w:r>
     </w:p>
     <w:p>
@@ -6838,10 +6854,10 @@
           <w:b/>
           <w:color w:val="1A4A8A"/>
         </w:rPr>
-        <w:t xml:space="preserve">Encrypted Traffic Analysis: </w:t>
+        <w:t xml:space="preserve">Server-Side TLS Correlation (JA3S + Certificate Issuer): </w:t>
       </w:r>
       <w:r>
-        <w:t>While payload analysis of HTTPS is not feasible, TLS metadata (JA3/JA3S fingerprints, certificate issuer, SNI patterns, flow timing) can reveal malicious tools even through encryption — particularly C2 frameworks and RATs.</w:t>
+        <w:t>The current TLS inspector fingerprints the client's Hello (JA3, SNI, cipher suites, version). A natural extension is JA3S fingerprinting of the server's response and certificate-issuer/flow-timing correlation across a session — revealing malicious C2 servers even when the client side looks unremarkable.</w:t>
       </w:r>
     </w:p>
     <w:p>
@@ -6854,10 +6870,10 @@
           <w:b/>
           <w:color w:val="1A4A8A"/>
         </w:rPr>
-        <w:t xml:space="preserve">Mobile Companion App: </w:t>
+        <w:t xml:space="preserve">Native Mobile App with Push Notifications: </w:t>
       </w:r>
       <w:r>
-        <w:t>A mobile dashboard (React Native or Flutter) receiving push notifications for critical alerts would allow administrators to monitor the system remotely without requiring VPN access.</w:t>
+        <w:t>The current web/mobile companion (a JWT-authenticated, mobile-responsive Flask dashboard on the LAN) requires opening a browser and has no push notifications. A native app (React Native or Flutter) with OS-level push for critical alerts would let administrators monitor the system without keeping a browser tab open.</w:t>
       </w:r>
     </w:p>
     <w:p>

</xml_diff>